<commit_message>
Replace matplotlib arch diagrams with Graphviz dot layout
- Remove debug=True flags from fig_a1 and fig_a3 _save_gv calls
- Delete .dot debug artifacts from report/figures/
- Rebuild architecture.docx with clean Graphviz PNG figures

Co-authored-by: Copilot <223556219+Copilot@users.noreply.github.com>
</commit_message>
<xml_diff>
--- a/report/architecture.docx
+++ b/report/architecture.docx
@@ -238,7 +238,7 @@
       <w:r>
         <w:drawing>
           <wp:inline xmlns:a="http://schemas.openxmlformats.org/drawingml/2006/main" xmlns:pic="http://schemas.openxmlformats.org/drawingml/2006/picture">
-            <wp:extent cx="5029200" cy="2760178"/>
+            <wp:extent cx="5029200" cy="4191892"/>
             <wp:docPr id="1" name="Picture 1"/>
             <wp:cNvGraphicFramePr>
               <a:graphicFrameLocks noChangeAspect="1"/>
@@ -259,7 +259,7 @@
                   <pic:spPr>
                     <a:xfrm>
                       <a:off x="0" y="0"/>
-                      <a:ext cx="5029200" cy="2760178"/>
+                      <a:ext cx="5029200" cy="4191892"/>
                     </a:xfrm>
                     <a:prstGeom prst="rect"/>
                   </pic:spPr>
@@ -380,7 +380,7 @@
       <w:r>
         <w:drawing>
           <wp:inline xmlns:a="http://schemas.openxmlformats.org/drawingml/2006/main" xmlns:pic="http://schemas.openxmlformats.org/drawingml/2006/picture">
-            <wp:extent cx="5029200" cy="3052437"/>
+            <wp:extent cx="5029200" cy="5857012"/>
             <wp:docPr id="2" name="Picture 2"/>
             <wp:cNvGraphicFramePr>
               <a:graphicFrameLocks noChangeAspect="1"/>
@@ -401,7 +401,7 @@
                   <pic:spPr>
                     <a:xfrm>
                       <a:off x="0" y="0"/>
-                      <a:ext cx="5029200" cy="3052437"/>
+                      <a:ext cx="5029200" cy="5857012"/>
                     </a:xfrm>
                     <a:prstGeom prst="rect"/>
                   </pic:spPr>
@@ -507,7 +507,7 @@
       <w:r>
         <w:drawing>
           <wp:inline xmlns:a="http://schemas.openxmlformats.org/drawingml/2006/main" xmlns:pic="http://schemas.openxmlformats.org/drawingml/2006/picture">
-            <wp:extent cx="5029200" cy="2954022"/>
+            <wp:extent cx="5029200" cy="3844664"/>
             <wp:docPr id="3" name="Picture 3"/>
             <wp:cNvGraphicFramePr>
               <a:graphicFrameLocks noChangeAspect="1"/>
@@ -528,7 +528,7 @@
                   <pic:spPr>
                     <a:xfrm>
                       <a:off x="0" y="0"/>
-                      <a:ext cx="5029200" cy="2954022"/>
+                      <a:ext cx="5029200" cy="3844664"/>
                     </a:xfrm>
                     <a:prstGeom prst="rect"/>
                   </pic:spPr>
@@ -1907,7 +1907,7 @@
       <w:r>
         <w:drawing>
           <wp:inline xmlns:a="http://schemas.openxmlformats.org/drawingml/2006/main" xmlns:pic="http://schemas.openxmlformats.org/drawingml/2006/picture">
-            <wp:extent cx="5029200" cy="2187926"/>
+            <wp:extent cx="5029200" cy="2309503"/>
             <wp:docPr id="4" name="Picture 4"/>
             <wp:cNvGraphicFramePr>
               <a:graphicFrameLocks noChangeAspect="1"/>
@@ -1928,7 +1928,7 @@
                   <pic:spPr>
                     <a:xfrm>
                       <a:off x="0" y="0"/>
-                      <a:ext cx="5029200" cy="2187926"/>
+                      <a:ext cx="5029200" cy="2309503"/>
                     </a:xfrm>
                     <a:prstGeom prst="rect"/>
                   </pic:spPr>
@@ -3762,7 +3762,7 @@
       <w:r>
         <w:drawing>
           <wp:inline xmlns:a="http://schemas.openxmlformats.org/drawingml/2006/main" xmlns:pic="http://schemas.openxmlformats.org/drawingml/2006/picture">
-            <wp:extent cx="5029200" cy="2313631"/>
+            <wp:extent cx="5029200" cy="2227421"/>
             <wp:docPr id="5" name="Picture 5"/>
             <wp:cNvGraphicFramePr>
               <a:graphicFrameLocks noChangeAspect="1"/>
@@ -3783,7 +3783,7 @@
                   <pic:spPr>
                     <a:xfrm>
                       <a:off x="0" y="0"/>
-                      <a:ext cx="5029200" cy="2313631"/>
+                      <a:ext cx="5029200" cy="2227421"/>
                     </a:xfrm>
                     <a:prstGeom prst="rect"/>
                   </pic:spPr>

</xml_diff>